<commit_message>
definições e ajustes ANTES da reuniao 17/04/2026
</commit_message>
<xml_diff>
--- a/project/research/FLUXOS-AUTENTICACAO-ANALISE-TECNICA.docx
+++ b/project/research/FLUXOS-AUTENTICACAO-ANALISE-TECNICA.docx
@@ -23,7 +23,7 @@
         <w:pStyle w:val="Date"/>
       </w:pPr>
       <w:r>
-        <w:t xml:space="preserve">2026-04-16</w:t>
+        <w:t xml:space="preserve">2026-04-17</w:t>
       </w:r>
     </w:p>
     <w:p>
@@ -1716,7 +1716,7 @@
               <a:graphicData uri="http://schemas.openxmlformats.org/drawingml/2006/picture">
                 <pic:pic>
                   <pic:nvPicPr>
-                    <pic:cNvPr descr="FLUXOS-AUTENTICACAO-ANALISE-TECNICA-rendered_images/diagram-01-1776363332.png" id="17" name="Picture"/>
+                    <pic:cNvPr descr="FLUXOS-AUTENTICACAO-ANALISE-TECNICA-rendered_images/diagram-01-1776419536.png" id="17" name="Picture"/>
                     <pic:cNvPicPr>
                       <a:picLocks noChangeArrowheads="1" noChangeAspect="1"/>
                     </pic:cNvPicPr>
@@ -2289,7 +2289,7 @@
         <w:rPr>
           <w:rStyle w:val="VerbatimChar"/>
         </w:rPr>
-        <w:t xml:space="preserve">                       TTL: 30 min              (rotacionado)</w:t>
+        <w:t xml:space="preserve">                       TTL: 30 min              (fixo por sessão)</w:t>
       </w:r>
     </w:p>
     <w:p>
@@ -3000,7 +3000,7 @@
           <w:b/>
           <w:bCs/>
         </w:rPr>
-        <w:t xml:space="preserve">Rotação de Access Token (DEC-013):</w:t>
+        <w:t xml:space="preserve">Access Token Siebel — Sem Rotação, Header OAuth Dinâmico (DEC-013):</w:t>
       </w:r>
     </w:p>
     <w:p>
@@ -3008,7 +3008,7 @@
         <w:pStyle w:val="BodyText"/>
       </w:pPr>
       <w:r>
-        <w:t xml:space="preserve">O backend Siebel implementa rotação automática: cada resposta inclui um novo</w:t>
+        <w:t xml:space="preserve">O</w:t>
       </w:r>
       <w:r>
         <w:t xml:space="preserve"> </w:t>
@@ -3020,7 +3020,39 @@
         <w:t xml:space="preserve">apiToken</w:t>
       </w:r>
       <w:r>
-        <w:t xml:space="preserve">. O BFF não implementa renovação proactiva — em vez disso:</w:t>
+        <w:t xml:space="preserve"> </w:t>
+      </w:r>
+      <w:r>
+        <w:t xml:space="preserve">devolvido pelo Siebel</w:t>
+      </w:r>
+      <w:r>
+        <w:t xml:space="preserve"> </w:t>
+      </w:r>
+      <w:r>
+        <w:rPr>
+          <w:b/>
+          <w:bCs/>
+        </w:rPr>
+        <w:t xml:space="preserve">não expira e nunca é rotacionado</w:t>
+      </w:r>
+      <w:r>
+        <w:t xml:space="preserve"> </w:t>
+      </w:r>
+      <w:r>
+        <w:t xml:space="preserve">— é armazenado em Redis após o login e reutilizado durante toda a sessão. O que varia em cada chamada ao Siebel é o</w:t>
+      </w:r>
+      <w:r>
+        <w:t xml:space="preserve"> </w:t>
+      </w:r>
+      <w:r>
+        <w:rPr>
+          <w:b/>
+          <w:bCs/>
+        </w:rPr>
+        <w:t xml:space="preserve">header Authorization OAuth</w:t>
+      </w:r>
+      <w:r>
+        <w:t xml:space="preserve">, gerado dinamicamente pelo BFF:</w:t>
       </w:r>
     </w:p>
     <w:p>
@@ -3032,7 +3064,7 @@
         </w:numPr>
       </w:pPr>
       <w:r>
-        <w:t xml:space="preserve">BFF recebe resposta do Siebel com novo</w:t>
+        <w:t xml:space="preserve">BFF recupera o</w:t>
       </w:r>
       <w:r>
         <w:t xml:space="preserve"> </w:t>
@@ -3042,6 +3074,12 @@
           <w:rStyle w:val="VerbatimChar"/>
         </w:rPr>
         <w:t xml:space="preserve">apiToken</w:t>
+      </w:r>
+      <w:r>
+        <w:t xml:space="preserve"> </w:t>
+      </w:r>
+      <w:r>
+        <w:t xml:space="preserve">de Redis (valor constante durante a sessão)</w:t>
       </w:r>
     </w:p>
     <w:p>
@@ -3053,23 +3091,22 @@
         </w:numPr>
       </w:pPr>
       <w:r>
-        <w:t xml:space="preserve">BFF actualiza</w:t>
-      </w:r>
-      <w:r>
-        <w:t xml:space="preserve"> </w:t>
-      </w:r>
-      <w:r>
-        <w:rPr>
-          <w:b/>
-          <w:bCs/>
-        </w:rPr>
-        <w:t xml:space="preserve">imediatamente</w:t>
-      </w:r>
-      <w:r>
-        <w:t xml:space="preserve"> </w:t>
-      </w:r>
-      <w:r>
-        <w:t xml:space="preserve">o token em Redis antes de responder ao frontend</w:t>
+        <w:t xml:space="preserve">BFF gera um novo</w:t>
+      </w:r>
+      <w:r>
+        <w:t xml:space="preserve"> </w:t>
+      </w:r>
+      <w:r>
+        <w:rPr>
+          <w:rStyle w:val="VerbatimChar"/>
+        </w:rPr>
+        <w:t xml:space="preserve">oauth_guid</w:t>
+      </w:r>
+      <w:r>
+        <w:t xml:space="preserve"> </w:t>
+      </w:r>
+      <w:r>
+        <w:t xml:space="preserve">único para o pedido</w:t>
       </w:r>
     </w:p>
     <w:p>
@@ -3081,7 +3118,22 @@
         </w:numPr>
       </w:pPr>
       <w:r>
-        <w:t xml:space="preserve">O token em cache é sempre o mais recente</w:t>
+        <w:t xml:space="preserve">BFF usa o</w:t>
+      </w:r>
+      <w:r>
+        <w:t xml:space="preserve"> </w:t>
+      </w:r>
+      <w:r>
+        <w:rPr>
+          <w:rStyle w:val="VerbatimChar"/>
+        </w:rPr>
+        <w:t xml:space="preserve">oauth_timestamp</w:t>
+      </w:r>
+      <w:r>
+        <w:t xml:space="preserve"> </w:t>
+      </w:r>
+      <w:r>
+        <w:t xml:space="preserve">actual (unix time no momento da chamada)</w:t>
       </w:r>
     </w:p>
     <w:p>
@@ -3093,7 +3145,49 @@
         </w:numPr>
       </w:pPr>
       <w:r>
-        <w:t xml:space="preserve">TTL de 15 minutos é salvaguarda em caso de inatividade prolongada</w:t>
+        <w:t xml:space="preserve">BFF recalcula</w:t>
+      </w:r>
+      <w:r>
+        <w:t xml:space="preserve"> </w:t>
+      </w:r>
+      <w:r>
+        <w:rPr>
+          <w:rStyle w:val="VerbatimChar"/>
+        </w:rPr>
+        <w:t xml:space="preserve">oauth_signature</w:t>
+      </w:r>
+      <w:r>
+        <w:t xml:space="preserve"> </w:t>
+      </w:r>
+      <w:r>
+        <w:t xml:space="preserve">via HMAC-SHA256 sobre todos os campos</w:t>
+      </w:r>
+    </w:p>
+    <w:p>
+      <w:pPr>
+        <w:pStyle w:val="Compact"/>
+        <w:numPr>
+          <w:ilvl w:val="0"/>
+          <w:numId w:val="1008"/>
+        </w:numPr>
+      </w:pPr>
+      <w:r>
+        <w:t xml:space="preserve">O header resultante é único por pedido — o</w:t>
+      </w:r>
+      <w:r>
+        <w:t xml:space="preserve"> </w:t>
+      </w:r>
+      <w:r>
+        <w:rPr>
+          <w:rStyle w:val="VerbatimChar"/>
+        </w:rPr>
+        <w:t xml:space="preserve">apiToken</w:t>
+      </w:r>
+      <w:r>
+        <w:t xml:space="preserve"> </w:t>
+      </w:r>
+      <w:r>
+        <w:t xml:space="preserve">subjacente permanece constante</w:t>
       </w:r>
     </w:p>
     <w:p>
@@ -3105,13 +3199,13 @@
           <w:b/>
           <w:bCs/>
         </w:rPr>
-        <w:t xml:space="preserve">Sem Refresh Token:</w:t>
-      </w:r>
-      <w:r>
-        <w:t xml:space="preserve"> </w:t>
-      </w:r>
-      <w:r>
-        <w:t xml:space="preserve">O canal web não utiliza Refresh Token (confirmado em DEC-002 e DEC-013).</w:t>
+        <w:t xml:space="preserve">Sem Refresh Token, sem renovação:</w:t>
+      </w:r>
+      <w:r>
+        <w:t xml:space="preserve"> </w:t>
+      </w:r>
+      <w:r>
+        <w:t xml:space="preserve">Os TTLs (15 min / 30 min) aplicam-se exclusivamente à sessão web (camada BFF-Frontend) e não ao token do Siebel.</w:t>
       </w:r>
     </w:p>
     <w:bookmarkEnd w:id="20"/>
@@ -3607,13 +3701,70 @@
           <w:b/>
           <w:bCs/>
         </w:rPr>
-        <w:t xml:space="preserve">DEC-013 — Rotação de Access Token:</w:t>
-      </w:r>
-      <w:r>
-        <w:t xml:space="preserve"> </w:t>
-      </w:r>
-      <w:r>
-        <w:t xml:space="preserve">Elimina a necessidade de lógica de renovação proactiva no BFF, aproveitando o comportamento nativo do Siebel (OAuth 1.1) que rotaciona o token a cada resposta.</w:t>
+        <w:t xml:space="preserve">DEC-013 — Access Token Siebel (Sem Rotação):</w:t>
+      </w:r>
+      <w:r>
+        <w:t xml:space="preserve"> </w:t>
+      </w:r>
+      <w:r>
+        <w:t xml:space="preserve">O</w:t>
+      </w:r>
+      <w:r>
+        <w:t xml:space="preserve"> </w:t>
+      </w:r>
+      <w:r>
+        <w:rPr>
+          <w:rStyle w:val="VerbatimChar"/>
+        </w:rPr>
+        <w:t xml:space="preserve">apiToken</w:t>
+      </w:r>
+      <w:r>
+        <w:t xml:space="preserve"> </w:t>
+      </w:r>
+      <w:r>
+        <w:t xml:space="preserve">é armazenado em Redis após login e reutilizado durante toda a sessão. O BFF não implementa renovação nem rotação do token Siebel. A cada chamada, o BFF gera dinamicamente um novo header Authorization OAuth com</w:t>
+      </w:r>
+      <w:r>
+        <w:t xml:space="preserve"> </w:t>
+      </w:r>
+      <w:r>
+        <w:rPr>
+          <w:rStyle w:val="VerbatimChar"/>
+        </w:rPr>
+        <w:t xml:space="preserve">oauth_guid</w:t>
+      </w:r>
+      <w:r>
+        <w:t xml:space="preserve">,</w:t>
+      </w:r>
+      <w:r>
+        <w:t xml:space="preserve"> </w:t>
+      </w:r>
+      <w:r>
+        <w:rPr>
+          <w:rStyle w:val="VerbatimChar"/>
+        </w:rPr>
+        <w:t xml:space="preserve">oauth_timestamp</w:t>
+      </w:r>
+      <w:r>
+        <w:t xml:space="preserve"> </w:t>
+      </w:r>
+      <w:r>
+        <w:t xml:space="preserve">e</w:t>
+      </w:r>
+      <w:r>
+        <w:t xml:space="preserve"> </w:t>
+      </w:r>
+      <w:r>
+        <w:rPr>
+          <w:rStyle w:val="VerbatimChar"/>
+        </w:rPr>
+        <w:t xml:space="preserve">oauth_signature</w:t>
+      </w:r>
+      <w:r>
+        <w:t xml:space="preserve"> </w:t>
+      </w:r>
+      <w:r>
+        <w:t xml:space="preserve">(HMAC-SHA256) frescos.</w:t>
       </w:r>
     </w:p>
     <w:bookmarkEnd w:id="22"/>
@@ -5436,7 +5587,7 @@
               <a:graphicData uri="http://schemas.openxmlformats.org/drawingml/2006/picture">
                 <pic:pic>
                   <pic:nvPicPr>
-                    <pic:cNvPr descr="FLUXOS-AUTENTICACAO-ANALISE-TECNICA-rendered_images/diagram-02-1776363332.png" id="31" name="Picture"/>
+                    <pic:cNvPr descr="FLUXOS-AUTENTICACAO-ANALISE-TECNICA-rendered_images/diagram-02-1776419536.png" id="31" name="Picture"/>
                     <pic:cNvPicPr>
                       <a:picLocks noChangeArrowheads="1" noChangeAspect="1"/>
                     </pic:cNvPicPr>
@@ -5880,13 +6031,55 @@
           <w:b/>
           <w:bCs/>
         </w:rPr>
-        <w:t xml:space="preserve">Rotação de Access Token (DEC-013):</w:t>
-      </w:r>
-      <w:r>
-        <w:t xml:space="preserve"> </w:t>
-      </w:r>
-      <w:r>
-        <w:t xml:space="preserve">Aplicável da mesma forma — token actualizado a cada resposta do Siebel</w:t>
+        <w:t xml:space="preserve">Access Token Siebel (DEC-013):</w:t>
+      </w:r>
+      <w:r>
+        <w:t xml:space="preserve"> </w:t>
+      </w:r>
+      <w:r>
+        <w:t xml:space="preserve">O</w:t>
+      </w:r>
+      <w:r>
+        <w:t xml:space="preserve"> </w:t>
+      </w:r>
+      <w:r>
+        <w:rPr>
+          <w:rStyle w:val="VerbatimChar"/>
+        </w:rPr>
+        <w:t xml:space="preserve">apiToken</w:t>
+      </w:r>
+      <w:r>
+        <w:t xml:space="preserve"> </w:t>
+      </w:r>
+      <w:r>
+        <w:t xml:space="preserve">é fixo durante a sessão. A cada chamada ao Siebel o BFF gera header OAuth dinâmico (novo</w:t>
+      </w:r>
+      <w:r>
+        <w:t xml:space="preserve"> </w:t>
+      </w:r>
+      <w:r>
+        <w:rPr>
+          <w:rStyle w:val="VerbatimChar"/>
+        </w:rPr>
+        <w:t xml:space="preserve">oauth_guid</w:t>
+      </w:r>
+      <w:r>
+        <w:t xml:space="preserve">,</w:t>
+      </w:r>
+      <w:r>
+        <w:t xml:space="preserve"> </w:t>
+      </w:r>
+      <w:r>
+        <w:rPr>
+          <w:rStyle w:val="VerbatimChar"/>
+        </w:rPr>
+        <w:t xml:space="preserve">oauth_timestamp</w:t>
+      </w:r>
+      <w:r>
+        <w:t xml:space="preserve"> </w:t>
+      </w:r>
+      <w:r>
+        <w:t xml:space="preserve">e assinatura HMAC-SHA256)</w:t>
       </w:r>
     </w:p>
     <w:p>
@@ -6532,7 +6725,22 @@
         <w:t xml:space="preserve"> </w:t>
       </w:r>
       <w:r>
-        <w:t xml:space="preserve">Rotação de token aplicável da mesma forma após estabelecimento de sessão.</w:t>
+        <w:t xml:space="preserve">O</w:t>
+      </w:r>
+      <w:r>
+        <w:t xml:space="preserve"> </w:t>
+      </w:r>
+      <w:r>
+        <w:rPr>
+          <w:rStyle w:val="VerbatimChar"/>
+        </w:rPr>
+        <w:t xml:space="preserve">apiToken</w:t>
+      </w:r>
+      <w:r>
+        <w:t xml:space="preserve"> </w:t>
+      </w:r>
+      <w:r>
+        <w:t xml:space="preserve">é armazenado em Redis e reutilizado durante toda a sessão. A cada chamada ao Siebel, o BFF gera header OAuth dinâmico (GUID, timestamp e assinatura HMAC-SHA256 frescos).</w:t>
       </w:r>
     </w:p>
     <w:bookmarkEnd w:id="36"/>
@@ -8020,7 +8228,7 @@
               <a:graphicData uri="http://schemas.openxmlformats.org/drawingml/2006/picture">
                 <pic:pic>
                   <pic:nvPicPr>
-                    <pic:cNvPr descr="FLUXOS-AUTENTICACAO-ANALISE-TECNICA-rendered_images/diagram-03-1776363332.png" id="45" name="Picture"/>
+                    <pic:cNvPr descr="FLUXOS-AUTENTICACAO-ANALISE-TECNICA-rendered_images/diagram-03-1776419536.png" id="45" name="Picture"/>
                     <pic:cNvPicPr>
                       <a:picLocks noChangeArrowheads="1" noChangeAspect="1"/>
                     </pic:cNvPicPr>
@@ -9250,13 +9458,55 @@
           <w:b/>
           <w:bCs/>
         </w:rPr>
-        <w:t xml:space="preserve">Rotação de Access Token (DEC-013):</w:t>
-      </w:r>
-      <w:r>
-        <w:t xml:space="preserve"> </w:t>
-      </w:r>
-      <w:r>
-        <w:t xml:space="preserve">Aplicável da mesma forma</w:t>
+        <w:t xml:space="preserve">Access Token Siebel (DEC-013):</w:t>
+      </w:r>
+      <w:r>
+        <w:t xml:space="preserve"> </w:t>
+      </w:r>
+      <w:r>
+        <w:t xml:space="preserve">O</w:t>
+      </w:r>
+      <w:r>
+        <w:t xml:space="preserve"> </w:t>
+      </w:r>
+      <w:r>
+        <w:rPr>
+          <w:rStyle w:val="VerbatimChar"/>
+        </w:rPr>
+        <w:t xml:space="preserve">apiToken</w:t>
+      </w:r>
+      <w:r>
+        <w:t xml:space="preserve"> </w:t>
+      </w:r>
+      <w:r>
+        <w:t xml:space="preserve">é fixo durante a sessão. A cada chamada ao Siebel o BFF gera header OAuth dinâmico (novo</w:t>
+      </w:r>
+      <w:r>
+        <w:t xml:space="preserve"> </w:t>
+      </w:r>
+      <w:r>
+        <w:rPr>
+          <w:rStyle w:val="VerbatimChar"/>
+        </w:rPr>
+        <w:t xml:space="preserve">oauth_guid</w:t>
+      </w:r>
+      <w:r>
+        <w:t xml:space="preserve">,</w:t>
+      </w:r>
+      <w:r>
+        <w:t xml:space="preserve"> </w:t>
+      </w:r>
+      <w:r>
+        <w:rPr>
+          <w:rStyle w:val="VerbatimChar"/>
+        </w:rPr>
+        <w:t xml:space="preserve">oauth_timestamp</w:t>
+      </w:r>
+      <w:r>
+        <w:t xml:space="preserve"> </w:t>
+      </w:r>
+      <w:r>
+        <w:t xml:space="preserve">e assinatura HMAC-SHA256)</w:t>
       </w:r>
     </w:p>
     <w:bookmarkEnd w:id="49"/>
@@ -11441,7 +11691,7 @@
               <a:graphicData uri="http://schemas.openxmlformats.org/drawingml/2006/picture">
                 <pic:pic>
                   <pic:nvPicPr>
-                    <pic:cNvPr descr="FLUXOS-AUTENTICACAO-ANALISE-TECNICA-rendered_images/diagram-04-1776363332.png" id="60" name="Picture"/>
+                    <pic:cNvPr descr="FLUXOS-AUTENTICACAO-ANALISE-TECNICA-rendered_images/diagram-04-1776419536.png" id="60" name="Picture"/>
                     <pic:cNvPicPr>
                       <a:picLocks noChangeArrowheads="1" noChangeAspect="1"/>
                     </pic:cNvPicPr>
@@ -12194,13 +12444,55 @@
           <w:b/>
           <w:bCs/>
         </w:rPr>
-        <w:t xml:space="preserve">Rotação de Access Token (DEC-013):</w:t>
-      </w:r>
-      <w:r>
-        <w:t xml:space="preserve"> </w:t>
-      </w:r>
-      <w:r>
-        <w:t xml:space="preserve">Siebel rotaciona token a cada resposta; BFF actualiza Redis imediatamente</w:t>
+        <w:t xml:space="preserve">Access Token Siebel (DEC-013):</w:t>
+      </w:r>
+      <w:r>
+        <w:t xml:space="preserve"> </w:t>
+      </w:r>
+      <w:r>
+        <w:t xml:space="preserve">O</w:t>
+      </w:r>
+      <w:r>
+        <w:t xml:space="preserve"> </w:t>
+      </w:r>
+      <w:r>
+        <w:rPr>
+          <w:rStyle w:val="VerbatimChar"/>
+        </w:rPr>
+        <w:t xml:space="preserve">apiToken</w:t>
+      </w:r>
+      <w:r>
+        <w:t xml:space="preserve"> </w:t>
+      </w:r>
+      <w:r>
+        <w:t xml:space="preserve">é fixo durante a sessão. A cada chamada ao Siebel o BFF gera header OAuth dinâmico (novo</w:t>
+      </w:r>
+      <w:r>
+        <w:t xml:space="preserve"> </w:t>
+      </w:r>
+      <w:r>
+        <w:rPr>
+          <w:rStyle w:val="VerbatimChar"/>
+        </w:rPr>
+        <w:t xml:space="preserve">oauth_guid</w:t>
+      </w:r>
+      <w:r>
+        <w:t xml:space="preserve">,</w:t>
+      </w:r>
+      <w:r>
+        <w:t xml:space="preserve"> </w:t>
+      </w:r>
+      <w:r>
+        <w:rPr>
+          <w:rStyle w:val="VerbatimChar"/>
+        </w:rPr>
+        <w:t xml:space="preserve">oauth_timestamp</w:t>
+      </w:r>
+      <w:r>
+        <w:t xml:space="preserve"> </w:t>
+      </w:r>
+      <w:r>
+        <w:t xml:space="preserve">e assinatura HMAC-SHA256)</w:t>
       </w:r>
     </w:p>
     <w:p>
@@ -13002,7 +13294,22 @@
         <w:t xml:space="preserve"> </w:t>
       </w:r>
       <w:r>
-        <w:t xml:space="preserve">Rotação de token aplicável após estabelecimento de sessão.</w:t>
+        <w:t xml:space="preserve">O</w:t>
+      </w:r>
+      <w:r>
+        <w:t xml:space="preserve"> </w:t>
+      </w:r>
+      <w:r>
+        <w:rPr>
+          <w:rStyle w:val="VerbatimChar"/>
+        </w:rPr>
+        <w:t xml:space="preserve">apiToken</w:t>
+      </w:r>
+      <w:r>
+        <w:t xml:space="preserve"> </w:t>
+      </w:r>
+      <w:r>
+        <w:t xml:space="preserve">é armazenado em Redis e reutilizado durante toda a sessão. A cada chamada ao Siebel, o BFF gera header OAuth dinâmico (GUID, timestamp e assinatura HMAC-SHA256 frescos).</w:t>
       </w:r>
     </w:p>
     <w:bookmarkEnd w:id="65"/>
@@ -14532,7 +14839,7 @@
           <w:rPr>
             <w:rStyle w:val="Hyperlink"/>
           </w:rPr>
-          <w:t xml:space="preserve">DEC-013 — Rotação de Access Token por Resposta do Backend</w:t>
+          <w:t xml:space="preserve">DEC-013 — Access Token Siebel: Sem Rotação, Header OAuth Dinâmico</w:t>
         </w:r>
       </w:hyperlink>
     </w:p>

</xml_diff>